<commit_message>
Paper 3 ready for either venue: withdrawal disclosure in JMIR cover letter, supervisor gates in READMEs, venue decision note
Co-Authored-By: Claude Fable 5 <noreply@anthropic.com>
Claude-Session: https://claude.ai/code/session_01KoT3i8geZspYBMMKVYJUTG
</commit_message>
<xml_diff>
--- a/docs/papers/paper3_submission/jmir_variant/Cover_Letter_Paper3_JMIR.docx
+++ b/docs/papers/paper3_submission/jmir_variant/Cover_Letter_Paper3_JMIR.docx
@@ -17,7 +17,7 @@
     </w:p>
     <w:p>
       <w:r>
-        <w:t>11 September 2026</w:t>
+        <w:t>September 2026 [date to be set on the day of submission]</w:t>
       </w:r>
     </w:p>
     <w:p>
@@ -64,7 +64,7 @@
         <w:jc w:val="both"/>
       </w:pPr>
       <w:r>
-        <w:t>Declarations. The manuscript is original, has not been published, and is not under consideration elsewhere. A conference paper (Tam &amp; Cheung, ICMSS 2026) reports the programme's Stage-1 review; a companion manuscript, currently under review at another journal, reports the Stage-2 coupled deployment; no results are duplicated. The programme was approved by The Hong Kong Polytechnic University (application HSEARS20260805008; approved 6 August 2026; approval period 16 June 2024 to 30 October 2026; PI Prof. C. F. Cheung). This study used an informed, implied-consent model, stated with its limitation in the Methods. Funding, conflicts, data-availability and AI-use declarations appear in the manuscript's Declarations section.</w:t>
+        <w:t>Declarations. The manuscript is original, has not been published, and is not under consideration elsewhere. A conference paper (Tam &amp; Cheung, ICMSS 2026) reports the programme's Stage-1 review; a companion manuscript, currently under review at another journal, reports the Stage-2 coupled deployment; no results are duplicated. The programme was approved by The Hong Kong Polytechnic University (application HSEARS20260805008; approved 6 August 2026; approval period 16 June 2024 to 30 October 2026; PI Prof. C. F. Cheung). This study used an informed, implied-consent model, stated with its limitation in the Methods. Funding, conflicts, data-availability and AI-use declarations appear in the manuscript's Declarations section. For completeness, we also disclose that an earlier manuscript from this programme (the Stage-2 companion study) was briefly submitted to JMIR Serious Games (ms #111728) and withdrawn by us on 11 September 2026, before initial checks were complete, when we recognised that it was concurrently under consideration at another journal; a full account and apology were provided to the editorial office. The present manuscript reports a different study, shares no results with that manuscript, and is submitted to JMIR Serious Games alone.</w:t>
       </w:r>
     </w:p>
     <w:p>

</xml_diff>